<commit_message>
Seminar: Wokwi project links
</commit_message>
<xml_diff>
--- a/02-seminar-iot-programming/Семинар_Программирование_для_IoT_Кайназар.docx
+++ b/02-seminar-iot-programming/Семинар_Программирование_для_IoT_Кайназар.docx
@@ -5336,7 +5336,14 @@
               <w:right w:w="110" w:type="dxa"/>
             </w:tcMar>
           </w:tcPr>
-          <w:p/>
+          <w:p>
+            <w:r>
+              <w:rPr>
+                <w:color w:val="1A3C8C"/>
+              </w:rPr>
+              <w:t>https://wokwi.com/projects/477581150199577601</w:t>
+            </w:r>
+          </w:p>
         </w:tc>
         <w:tc>
           <w:tcPr>
@@ -5354,7 +5361,14 @@
               <w:right w:w="110" w:type="dxa"/>
             </w:tcMar>
           </w:tcPr>
-          <w:p/>
+          <w:p>
+            <w:r>
+              <w:rPr>
+                <w:color w:val="1A3C8C"/>
+              </w:rPr>
+              <w:t>да</w:t>
+            </w:r>
+          </w:p>
         </w:tc>
       </w:tr>
       <w:tr>
@@ -5408,7 +5422,14 @@
               <w:right w:w="110" w:type="dxa"/>
             </w:tcMar>
           </w:tcPr>
-          <w:p/>
+          <w:p>
+            <w:r>
+              <w:rPr>
+                <w:color w:val="1A3C8C"/>
+              </w:rPr>
+              <w:t>https://wokwi.com/projects/477581592785773569</w:t>
+            </w:r>
+          </w:p>
         </w:tc>
         <w:tc>
           <w:tcPr>
@@ -5427,7 +5448,14 @@
               <w:right w:w="110" w:type="dxa"/>
             </w:tcMar>
           </w:tcPr>
-          <w:p/>
+          <w:p>
+            <w:r>
+              <w:rPr>
+                <w:color w:val="1A3C8C"/>
+              </w:rPr>
+              <w:t>да</w:t>
+            </w:r>
+          </w:p>
         </w:tc>
       </w:tr>
       <w:tr>
@@ -5479,7 +5507,14 @@
               <w:right w:w="110" w:type="dxa"/>
             </w:tcMar>
           </w:tcPr>
-          <w:p/>
+          <w:p>
+            <w:r>
+              <w:rPr>
+                <w:color w:val="1A3C8C"/>
+              </w:rPr>
+              <w:t>https://wokwi.com/projects/477581704298720257</w:t>
+            </w:r>
+          </w:p>
         </w:tc>
         <w:tc>
           <w:tcPr>
@@ -5497,7 +5532,14 @@
               <w:right w:w="110" w:type="dxa"/>
             </w:tcMar>
           </w:tcPr>
-          <w:p/>
+          <w:p>
+            <w:r>
+              <w:rPr>
+                <w:color w:val="1A3C8C"/>
+              </w:rPr>
+              <w:t>да</w:t>
+            </w:r>
+          </w:p>
         </w:tc>
       </w:tr>
       <w:tr>
@@ -5551,7 +5593,14 @@
               <w:right w:w="110" w:type="dxa"/>
             </w:tcMar>
           </w:tcPr>
-          <w:p/>
+          <w:p>
+            <w:r>
+              <w:rPr>
+                <w:color w:val="1A3C8C"/>
+              </w:rPr>
+              <w:t>https://wokwi.com/projects/477581817847989249</w:t>
+            </w:r>
+          </w:p>
         </w:tc>
         <w:tc>
           <w:tcPr>
@@ -5570,7 +5619,14 @@
               <w:right w:w="110" w:type="dxa"/>
             </w:tcMar>
           </w:tcPr>
-          <w:p/>
+          <w:p>
+            <w:r>
+              <w:rPr>
+                <w:color w:val="1A3C8C"/>
+              </w:rPr>
+              <w:t>да</w:t>
+            </w:r>
+          </w:p>
         </w:tc>
       </w:tr>
     </w:tbl>

</xml_diff>